<commit_message>
DBMS: place screenshots at a fixed 150 DPI instead of a fixed width
Forcing every shot to the column width blew the short ones up: Ex1B's two
\set AUTOCOMMIT captures are ~370px, so a 6.3" width rendered them at 58 DPI,
huge and blurry beside the wide ones. img_width() now sizes each shot at its
natural scale, capped at the column width, so console text is the same size
throughout and only the widest captures are shrunk.

Also corrects a note that outlived its subject: the record template was
renamed to a single space on disk, so three places claiming the filename has
a double space were wrong. The glob stays, in case it is re-sent as shipped.

Co-Authored-By: Claude Opus 5 <noreply@anthropic.com>
</commit_message>
<xml_diff>
--- a/Subjects/DBMS/records/Ex1A/Ex1A_Record_URK24CS1021.docx
+++ b/Subjects/DBMS/records/Ex1A/Ex1A_Record_URK24CS1021.docx
@@ -514,7 +514,7 @@
             <w:r>
               <w:drawing>
                 <wp:inline xmlns:a="http://schemas.openxmlformats.org/drawingml/2006/main" xmlns:pic="http://schemas.openxmlformats.org/drawingml/2006/picture">
-                  <wp:extent cx="5760720" cy="7560944"/>
+                  <wp:extent cx="5462016" cy="7168896"/>
                   <wp:docPr id="1" name="Picture 1"/>
                   <wp:cNvGraphicFramePr>
                     <a:graphicFrameLocks noChangeAspect="1"/>
@@ -535,7 +535,7 @@
                         <pic:spPr>
                           <a:xfrm>
                             <a:off x="0" y="0"/>
-                            <a:ext cx="5760720" cy="7560944"/>
+                            <a:ext cx="5462016" cy="7168896"/>
                           </a:xfrm>
                           <a:prstGeom prst="rect"/>
                         </pic:spPr>
@@ -679,7 +679,7 @@
             <w:r>
               <w:drawing>
                 <wp:inline xmlns:a="http://schemas.openxmlformats.org/drawingml/2006/main" xmlns:pic="http://schemas.openxmlformats.org/drawingml/2006/picture">
-                  <wp:extent cx="5760720" cy="1426198"/>
+                  <wp:extent cx="5023104" cy="1243584"/>
                   <wp:docPr id="3" name="Picture 3"/>
                   <wp:cNvGraphicFramePr>
                     <a:graphicFrameLocks noChangeAspect="1"/>
@@ -700,7 +700,7 @@
                         <pic:spPr>
                           <a:xfrm>
                             <a:off x="0" y="0"/>
-                            <a:ext cx="5760720" cy="1426198"/>
+                            <a:ext cx="5023104" cy="1243584"/>
                           </a:xfrm>
                           <a:prstGeom prst="rect"/>
                         </pic:spPr>
@@ -748,7 +748,7 @@
             <w:r>
               <w:drawing>
                 <wp:inline xmlns:a="http://schemas.openxmlformats.org/drawingml/2006/main" xmlns:pic="http://schemas.openxmlformats.org/drawingml/2006/picture">
-                  <wp:extent cx="5760720" cy="1669300"/>
+                  <wp:extent cx="4291584" cy="1243584"/>
                   <wp:docPr id="4" name="Picture 4"/>
                   <wp:cNvGraphicFramePr>
                     <a:graphicFrameLocks noChangeAspect="1"/>
@@ -769,7 +769,7 @@
                         <pic:spPr>
                           <a:xfrm>
                             <a:off x="0" y="0"/>
-                            <a:ext cx="5760720" cy="1669300"/>
+                            <a:ext cx="4291584" cy="1243584"/>
                           </a:xfrm>
                           <a:prstGeom prst="rect"/>
                         </pic:spPr>
@@ -817,7 +817,7 @@
             <w:r>
               <w:drawing>
                 <wp:inline xmlns:a="http://schemas.openxmlformats.org/drawingml/2006/main" xmlns:pic="http://schemas.openxmlformats.org/drawingml/2006/picture">
-                  <wp:extent cx="5760720" cy="1329397"/>
+                  <wp:extent cx="5388864" cy="1243584"/>
                   <wp:docPr id="5" name="Picture 5"/>
                   <wp:cNvGraphicFramePr>
                     <a:graphicFrameLocks noChangeAspect="1"/>
@@ -838,7 +838,7 @@
                         <pic:spPr>
                           <a:xfrm>
                             <a:off x="0" y="0"/>
-                            <a:ext cx="5760720" cy="1329397"/>
+                            <a:ext cx="5388864" cy="1243584"/>
                           </a:xfrm>
                           <a:prstGeom prst="rect"/>
                         </pic:spPr>
@@ -955,7 +955,7 @@
             <w:r>
               <w:drawing>
                 <wp:inline xmlns:a="http://schemas.openxmlformats.org/drawingml/2006/main" xmlns:pic="http://schemas.openxmlformats.org/drawingml/2006/picture">
-                  <wp:extent cx="5760720" cy="1468984"/>
+                  <wp:extent cx="4876800" cy="1243584"/>
                   <wp:docPr id="7" name="Picture 7"/>
                   <wp:cNvGraphicFramePr>
                     <a:graphicFrameLocks noChangeAspect="1"/>
@@ -976,7 +976,7 @@
                         <pic:spPr>
                           <a:xfrm>
                             <a:off x="0" y="0"/>
-                            <a:ext cx="5760720" cy="1468984"/>
+                            <a:ext cx="4876800" cy="1243584"/>
                           </a:xfrm>
                           <a:prstGeom prst="rect"/>
                         </pic:spPr>
@@ -1093,7 +1093,7 @@
             <w:r>
               <w:drawing>
                 <wp:inline xmlns:a="http://schemas.openxmlformats.org/drawingml/2006/main" xmlns:pic="http://schemas.openxmlformats.org/drawingml/2006/picture">
-                  <wp:extent cx="5760720" cy="1405726"/>
+                  <wp:extent cx="5096256" cy="1243584"/>
                   <wp:docPr id="9" name="Picture 9"/>
                   <wp:cNvGraphicFramePr>
                     <a:graphicFrameLocks noChangeAspect="1"/>
@@ -1114,7 +1114,7 @@
                         <pic:spPr>
                           <a:xfrm>
                             <a:off x="0" y="0"/>
-                            <a:ext cx="5760720" cy="1405726"/>
+                            <a:ext cx="5096256" cy="1243584"/>
                           </a:xfrm>
                           <a:prstGeom prst="rect"/>
                         </pic:spPr>
@@ -1162,7 +1162,7 @@
             <w:r>
               <w:drawing>
                 <wp:inline xmlns:a="http://schemas.openxmlformats.org/drawingml/2006/main" xmlns:pic="http://schemas.openxmlformats.org/drawingml/2006/picture">
-                  <wp:extent cx="5760720" cy="1311592"/>
+                  <wp:extent cx="5462016" cy="1243584"/>
                   <wp:docPr id="10" name="Picture 10"/>
                   <wp:cNvGraphicFramePr>
                     <a:graphicFrameLocks noChangeAspect="1"/>
@@ -1183,7 +1183,7 @@
                         <pic:spPr>
                           <a:xfrm>
                             <a:off x="0" y="0"/>
-                            <a:ext cx="5760720" cy="1311592"/>
+                            <a:ext cx="5462016" cy="1243584"/>
                           </a:xfrm>
                           <a:prstGeom prst="rect"/>
                         </pic:spPr>
@@ -1516,7 +1516,7 @@
             <w:r>
               <w:drawing>
                 <wp:inline xmlns:a="http://schemas.openxmlformats.org/drawingml/2006/main" xmlns:pic="http://schemas.openxmlformats.org/drawingml/2006/picture">
-                  <wp:extent cx="5760720" cy="2144502"/>
+                  <wp:extent cx="3340608" cy="1243584"/>
                   <wp:docPr id="15" name="Picture 15"/>
                   <wp:cNvGraphicFramePr>
                     <a:graphicFrameLocks noChangeAspect="1"/>
@@ -1537,7 +1537,7 @@
                         <pic:spPr>
                           <a:xfrm>
                             <a:off x="0" y="0"/>
-                            <a:ext cx="5760720" cy="2144502"/>
+                            <a:ext cx="3340608" cy="1243584"/>
                           </a:xfrm>
                           <a:prstGeom prst="rect"/>
                         </pic:spPr>

</xml_diff>